<commit_message>
Make Data & Policy manuscript numbers data-driven; add repo URL + field-presence clause to Data availability statement
Co-Authored-By: Tatsuki Onishi <bougtoir@gmail.com>
</commit_message>
<xml_diff>
--- a/discharged_secrets_ijcip/output/Manuscript_DataPolicy.docx
+++ b/discharged_secrets_ijcip/output/Manuscript_DataPolicy.docx
@@ -100,7 +100,7 @@
         <w:t xml:space="preserve">Results: </w:t>
       </w:r>
       <w:r>
-        <w:t>Eighteen direct studies were included (5 direct-empirical, 9 direct-documentary, and 4 near-domain), with the strongest evidence at the operation stage. Across 813 motorized micromobility feeds, vehicle identifiers appeared in 100% and coordinates in 99.4%, while battery percentage appeared in 68.9%. Operator notices documented operational processing thoroughly but were silent on device disposal and vulnerability reporting.</w:t>
+        <w:t>18 direct studies were included (5 direct-empirical, 9 direct-documentary, and 4 near-domain), with the strongest evidence at the operation stage. Across 813 motorized micromobility feeds, vehicle identifiers appeared in 100.0% and coordinates in 99.4%, while battery percentage appeared in 68.9%. Operator notices documented operational processing thoroughly but were silent on device disposal and vulnerability reporting.</w:t>
       </w:r>
     </w:p>
     <w:p>
@@ -678,7 +678,7 @@
           <w:rFonts w:ascii="Times New Roman" w:hAnsi="Times New Roman"/>
           <w:sz w:val="24"/>
         </w:rPr>
-        <w:t>We compiled 2,169 records from programmatic searches of open bibliographic metadata. Abstracts were retrieved automatically where a digital object identifier (DOI) was available (1,539 of 2,116 DOI records; 72.7%); the remaining records were screened on title and available metadata only. Title/abstract screening applied a deterministic rule set that combined target-domain relevance with the presence of a described data path, and recorded a decision and reason for every record. Because the rules are deterministic, we re-applied them to a delayed 20% sample (n = 447) and reproduced every original decision (100% agreement); this demonstrates computational reproducibility rather than inter-rater reliability, as a single reviewer conducted the screening.</w:t>
+        <w:t>We compiled 2,169 records from programmatic searches of open bibliographic metadata. A digital object identifier (DOI) was available for 2,116 of 2,169 records (97.6%), for which abstracts were retrieved automatically where possible; the remaining records were screened on title and available metadata only. Title/abstract screening applied a deterministic rule set that combined target-domain relevance with the presence of a described data path, and recorded a decision and reason for every record. Because the rules are deterministic, we re-applied them to a delayed 21% sample (n = 447) and reproduced every original decision (100% agreement); this demonstrates computational reproducibility rather than inter-rater reliability, as a single reviewer conducted the screening.</w:t>
       </w:r>
     </w:p>
     <w:p>
@@ -762,7 +762,7 @@
           <w:rFonts w:ascii="Times New Roman" w:hAnsi="Times New Roman"/>
           <w:sz w:val="24"/>
         </w:rPr>
-        <w:t>Of 2,169 records screened, 1,945 were excluded at title/abstract and 224 were sought for full text (Fig. 1). Of these, 79 could not be retrieved and were recorded as such rather than assessed; 127 retrieved records were excluded because they contained no relevant data path (90) or described a mechanism that did not transfer to the target domain (37). Eighteen direct studies were included: 5 at evidence distance D4, 9 at D3, and 4 at D2 (Fig. 2; Table 2).</w:t>
+        <w:t>Of 2,169 records screened, 1,945 were excluded at title/abstract and 224 were sought for full text (Fig. 1). Of these, 79 could not be retrieved and were recorded as such rather than assessed; 127 retrieved records were excluded because they contained no relevant data path (90) or described a mechanism that did not transfer to the target domain (37). 18 direct studies were included: 5 at evidence distance D4, 9 at D3, and 4 at D2 (Fig. 2; Table 2).</w:t>
       </w:r>
     </w:p>
     <w:p>
@@ -3871,7 +3871,7 @@
           <w:rFonts w:ascii="Times New Roman" w:hAnsi="Times New Roman"/>
           <w:sz w:val="24"/>
         </w:rPr>
-        <w:t>We coded 13 operator privacy notices across 14 domains; two further operators could not be retrieved as reproducible text and were recorded as unavailable (Fig. 4; Table 4). Operational and account-level processing was disclosed almost universally: location data were explicit for 11 of 13 operators, and retention, processors or contractors, and account/payment/device data were explicit for most. Data-subject rights and international transfers were explicit or partial for the large majority, consistent with a predominantly European operator sample governed by the General Data Protection Regulation (European Parliament and Council 2016).</w:t>
+        <w:t>We coded 13 operator privacy notices across 14 domains; 2 further operators could not be retrieved as reproducible text and were recorded as unavailable (Fig. 4; Table 4). Operational and account-level processing was disclosed almost universally: location data were explicit for 11 of 13 operators, and retention, processors or contractors, and account/payment/device data were explicit for most. Data-subject rights and international transfers were explicit or partial for the large majority, consistent with a predominantly European operator sample governed by the General Data Protection Regulation (European Parliament and Council 2016).</w:t>
       </w:r>
     </w:p>
     <w:p>
@@ -6475,7 +6475,7 @@
         <w:t xml:space="preserve">Data availability statement. </w:t>
       </w:r>
       <w:r>
-        <w:t>The data and code that support the findings of this study are openly available in the project repository at https://github.com/bougtoir/discharged-secrets-scoping-review. This includes the frozen GBFS registry snapshot and its checksum, the title/abstract and full-text screening decisions, the disclosure-audit coding sheets with verbatim locator quotations, the analysis results, and the figure- and table-generation code. Raw vehicle identifiers, exact coordinates, and vehicle-specific deep links were not retained. Every count, proportion, and confidence interval reported in the article can be regenerated from these materials with a single build command.</w:t>
+        <w:t>The data and code that support the findings of this study are openly available in the project repository at https://github.com/bougtoir/discharged-secrets-scoping-review. This includes the frozen GBFS registry snapshot and its checksum, the title/abstract and full-text screening decisions, the disclosure-audit coding sheets with verbatim locator quotations, the analysis scripts, the analysis results, and the figure- and table-generation code. Raw vehicle identifiers, exact coordinates, and vehicle-specific deep links were not retained; only field presence or absence was recorded. Every count, proportion, and confidence interval reported in the article can be regenerated from these materials with a single build command.</w:t>
       </w:r>
     </w:p>
     <w:p>

</xml_diff>